<commit_message>
Update OBIA classifier and instruction document
</commit_message>
<xml_diff>
--- a/AIML_CropMapper/AIML_CropMapper_instruction1.0.docx
+++ b/AIML_CropMapper/AIML_CropMapper_instruction1.0.docx
@@ -1816,6 +1816,7 @@
       <w:r>
         <w:rPr>
           <w:rFonts w:cs="Courier New"/>
+          <w:i/>
           <w:szCs w:val="20"/>
           <w:lang w:eastAsia="pl-PL"/>
         </w:rPr>
@@ -1824,6 +1825,7 @@
       <w:r>
         <w:rPr>
           <w:rFonts w:cs="Courier New"/>
+          <w:i/>
           <w:szCs w:val="20"/>
           <w:lang w:eastAsia="pl-PL"/>
         </w:rPr>
@@ -1832,6 +1834,7 @@
       <w:r>
         <w:rPr>
           <w:rFonts w:cs="Courier New"/>
+          <w:i/>
           <w:szCs w:val="20"/>
           <w:lang w:eastAsia="pl-PL"/>
         </w:rPr>
@@ -2177,6 +2180,7 @@
       <w:r>
         <w:rPr>
           <w:rFonts w:cs="Courier New"/>
+          <w:i/>
           <w:szCs w:val="20"/>
           <w:lang w:eastAsia="pl-PL"/>
         </w:rPr>
@@ -2554,6 +2558,7 @@
           <w:szCs w:val="24"/>
           <w:lang w:eastAsia="pl-PL"/>
         </w:rPr>
+        <w:lastRenderedPageBreak/>
         <w:t>Run the command:</w:t>
       </w:r>
       <w:r>
@@ -2569,6 +2574,7 @@
       <w:r>
         <w:rPr>
           <w:rFonts w:cs="Courier New"/>
+          <w:i/>
           <w:szCs w:val="20"/>
           <w:lang w:eastAsia="pl-PL"/>
         </w:rPr>
@@ -2604,6 +2610,7 @@
       <w:r>
         <w:rPr>
           <w:rFonts w:cs="Courier New"/>
+          <w:i/>
           <w:szCs w:val="20"/>
           <w:lang w:eastAsia="pl-PL"/>
         </w:rPr>
@@ -3017,6 +3024,7 @@
       <w:r>
         <w:rPr>
           <w:rFonts w:cs="Courier New"/>
+          <w:i/>
           <w:szCs w:val="20"/>
           <w:lang w:eastAsia="pl-PL"/>
         </w:rPr>
@@ -3553,6 +3561,7 @@
           <w:szCs w:val="24"/>
           <w:lang w:eastAsia="pl-PL"/>
         </w:rPr>
+        <w:lastRenderedPageBreak/>
         <w:t>What it does internally:</w:t>
       </w:r>
     </w:p>
@@ -3941,6 +3950,7 @@
       <w:r>
         <w:rPr>
           <w:rFonts w:cs="Courier New"/>
+          <w:i/>
           <w:szCs w:val="20"/>
           <w:lang w:eastAsia="pl-PL"/>
         </w:rPr>
@@ -4005,14 +4015,55 @@
     <w:p>
       <w:pPr>
         <w:spacing w:after="0" w:line="276" w:lineRule="auto"/>
-        <w:ind w:left="720"/>
-        <w:rPr>
-          <w:rFonts w:ascii="Times New Roman" w:eastAsia="Times New Roman" w:hAnsi="Times New Roman" w:cs="Times New Roman"/>
-          <w:sz w:val="24"/>
-          <w:szCs w:val="24"/>
-          <w:lang w:eastAsia="pl-PL"/>
-        </w:rPr>
-      </w:pPr>
+        <w:rPr>
+          <w:rFonts w:cs="Times New Roman"/>
+          <w:szCs w:val="24"/>
+          <w:lang w:eastAsia="pl-PL"/>
+        </w:rPr>
+      </w:pPr>
+    </w:p>
+    <w:p>
+      <w:pPr>
+        <w:spacing w:after="0" w:line="276" w:lineRule="auto"/>
+        <w:rPr>
+          <w:rFonts w:cs="Times New Roman"/>
+          <w:szCs w:val="24"/>
+          <w:lang w:eastAsia="pl-PL"/>
+        </w:rPr>
+      </w:pPr>
+      <w:r>
+        <w:rPr>
+          <w:rFonts w:cs="Times New Roman"/>
+          <w:b/>
+          <w:szCs w:val="24"/>
+          <w:lang w:eastAsia="pl-PL"/>
+        </w:rPr>
+        <w:t>Modular approach</w:t>
+      </w:r>
+      <w:r>
+        <w:rPr>
+          <w:rFonts w:cs="Times New Roman"/>
+          <w:szCs w:val="24"/>
+          <w:lang w:eastAsia="pl-PL"/>
+        </w:rPr>
+        <w:t xml:space="preserve"> – this mode user can run all of 11 stages of processing separately and </w:t>
+      </w:r>
+      <w:r>
+        <w:rPr>
+          <w:rFonts w:cs="Times New Roman"/>
+          <w:szCs w:val="24"/>
+          <w:lang w:eastAsia="pl-PL"/>
+        </w:rPr>
+        <w:t xml:space="preserve">select </w:t>
+      </w:r>
+      <w:r>
+        <w:rPr>
+          <w:rFonts w:cs="Times New Roman"/>
+          <w:szCs w:val="24"/>
+          <w:lang w:eastAsia="pl-PL"/>
+        </w:rPr>
+        <w:t>parameteres for segmentation, sample splitting training ML alghoritm and classification before executing</w:t>
+      </w:r>
     </w:p>
     <w:p>
       <w:pPr>
@@ -4027,97 +4078,148 @@
       <w:r>
         <w:rPr>
           <w:rFonts w:cs="Times New Roman"/>
-          <w:szCs w:val="24"/>
-          <w:lang w:eastAsia="pl-PL"/>
-        </w:rPr>
-        <w:t xml:space="preserve">In some cases if </w:t>
-      </w:r>
-      <w:r>
-        <w:rPr>
-          <w:rFonts w:cs="Times New Roman"/>
-          <w:szCs w:val="24"/>
-          <w:lang w:eastAsia="pl-PL"/>
-        </w:rPr>
-        <w:t xml:space="preserve">this </w:t>
-      </w:r>
-      <w:r>
-        <w:rPr>
-          <w:rFonts w:cs="Times New Roman"/>
-          <w:szCs w:val="24"/>
-          <w:lang w:eastAsia="pl-PL"/>
-        </w:rPr>
-        <w:t>error</w:t>
-      </w:r>
-      <w:r>
-        <w:rPr>
-          <w:rFonts w:cs="Times New Roman"/>
-          <w:szCs w:val="24"/>
-          <w:lang w:eastAsia="pl-PL"/>
-        </w:rPr>
-        <w:t xml:space="preserve"> </w:t>
-      </w:r>
-      <w:r>
-        <w:rPr>
-          <w:rFonts w:cs="Times New Roman"/>
-          <w:szCs w:val="24"/>
-          <w:lang w:eastAsia="pl-PL"/>
-        </w:rPr>
-        <w:t>occurs</w:t>
-      </w:r>
-      <w:r>
-        <w:rPr>
-          <w:rFonts w:cs="Times New Roman"/>
-          <w:szCs w:val="24"/>
-          <w:lang w:eastAsia="pl-PL"/>
-        </w:rPr>
-        <w:t xml:space="preserve"> </w:t>
-      </w:r>
-      <w:r>
-        <w:rPr>
-          <w:rFonts w:cs="Times New Roman"/>
-          <w:szCs w:val="24"/>
-          <w:lang w:eastAsia="pl-PL"/>
-        </w:rPr>
-        <w:t>(</w:t>
-      </w:r>
-      <w:r>
-        <w:rPr>
-          <w:rFonts w:cs="Times New Roman"/>
           <w:i/>
           <w:szCs w:val="24"/>
           <w:lang w:eastAsia="pl-PL"/>
         </w:rPr>
-        <w:t>OSError: could not find or load spatialindex_c-64.dll</w:t>
-      </w:r>
-      <w:r>
-        <w:rPr>
-          <w:rFonts w:cs="Times New Roman"/>
-          <w:szCs w:val="24"/>
-          <w:lang w:eastAsia="pl-PL"/>
-        </w:rPr>
-        <w:t>)</w:t>
-      </w:r>
-      <w:r>
-        <w:rPr>
-          <w:rFonts w:cs="Times New Roman"/>
-          <w:szCs w:val="24"/>
-          <w:lang w:eastAsia="pl-PL"/>
-        </w:rPr>
-        <w:t xml:space="preserve"> </w:t>
-      </w:r>
-      <w:r>
-        <w:rPr>
-          <w:rFonts w:cs="Times New Roman"/>
-          <w:szCs w:val="24"/>
-          <w:lang w:eastAsia="pl-PL"/>
-        </w:rPr>
-        <w:t>this comma</w:t>
+        <w:t xml:space="preserve">python </w:t>
       </w:r>
       <w:bookmarkStart w:id="0" w:name="_GoBack"/>
       <w:bookmarkEnd w:id="0"/>
       <w:r>
         <w:rPr>
           <w:rFonts w:cs="Times New Roman"/>
+          <w:i/>
+          <w:szCs w:val="24"/>
+          <w:lang w:eastAsia="pl-PL"/>
+        </w:rPr>
+        <w:t>1a_OBIA_vector_classifier_modular</w:t>
+      </w:r>
+      <w:r>
+        <w:rPr>
+          <w:rFonts w:cs="Times New Roman"/>
+          <w:i/>
+          <w:szCs w:val="24"/>
+          <w:lang w:eastAsia="pl-PL"/>
+        </w:rPr>
+        <w:t xml:space="preserve">.py </w:t>
+      </w:r>
+      <w:r>
+        <w:rPr>
+          <w:rFonts w:cs="Times New Roman"/>
+          <w:i/>
+          <w:szCs w:val="24"/>
+          <w:lang w:eastAsia="pl-PL"/>
+        </w:rPr>
+        <w:t>--track P4</w:t>
+      </w:r>
+    </w:p>
+    <w:p>
+      <w:pPr>
+        <w:spacing w:after="0" w:line="276" w:lineRule="auto"/>
+        <w:ind w:left="720"/>
+        <w:rPr>
+          <w:rFonts w:ascii="Times New Roman" w:eastAsia="Times New Roman" w:hAnsi="Times New Roman" w:cs="Times New Roman"/>
+          <w:sz w:val="24"/>
+          <w:szCs w:val="24"/>
+          <w:lang w:eastAsia="pl-PL"/>
+        </w:rPr>
+      </w:pPr>
+    </w:p>
+    <w:p>
+      <w:pPr>
+        <w:spacing w:after="0" w:line="276" w:lineRule="auto"/>
+        <w:rPr>
+          <w:rFonts w:cs="Times New Roman"/>
+          <w:i/>
+          <w:szCs w:val="24"/>
+          <w:lang w:eastAsia="pl-PL"/>
+        </w:rPr>
+      </w:pPr>
+      <w:r>
+        <w:rPr>
+          <w:rFonts w:cs="Times New Roman"/>
+          <w:szCs w:val="24"/>
+          <w:lang w:eastAsia="pl-PL"/>
+        </w:rPr>
+        <w:t xml:space="preserve">In some cases if </w:t>
+      </w:r>
+      <w:r>
+        <w:rPr>
+          <w:rFonts w:cs="Times New Roman"/>
+          <w:szCs w:val="24"/>
+          <w:lang w:eastAsia="pl-PL"/>
+        </w:rPr>
+        <w:t xml:space="preserve">this </w:t>
+      </w:r>
+      <w:r>
+        <w:rPr>
+          <w:rFonts w:cs="Times New Roman"/>
+          <w:szCs w:val="24"/>
+          <w:lang w:eastAsia="pl-PL"/>
+        </w:rPr>
+        <w:t>error</w:t>
+      </w:r>
+      <w:r>
+        <w:rPr>
+          <w:rFonts w:cs="Times New Roman"/>
+          <w:szCs w:val="24"/>
+          <w:lang w:eastAsia="pl-PL"/>
+        </w:rPr>
+        <w:t xml:space="preserve"> </w:t>
+      </w:r>
+      <w:r>
+        <w:rPr>
+          <w:rFonts w:cs="Times New Roman"/>
+          <w:szCs w:val="24"/>
+          <w:lang w:eastAsia="pl-PL"/>
+        </w:rPr>
+        <w:t xml:space="preserve">occurs </w:t>
+      </w:r>
+      <w:r>
+        <w:rPr>
+          <w:rFonts w:cs="Times New Roman"/>
+          <w:szCs w:val="24"/>
+          <w:lang w:eastAsia="pl-PL"/>
+        </w:rPr>
+        <w:t>(</w:t>
+      </w:r>
+      <w:r>
+        <w:rPr>
+          <w:rFonts w:cs="Times New Roman"/>
+          <w:i/>
+          <w:szCs w:val="24"/>
+          <w:lang w:eastAsia="pl-PL"/>
+        </w:rPr>
+        <w:t>OSError: could not find or load spatialindex_c-64.dll</w:t>
+      </w:r>
+      <w:r>
+        <w:rPr>
+          <w:rFonts w:cs="Times New Roman"/>
+          <w:szCs w:val="24"/>
+          <w:lang w:eastAsia="pl-PL"/>
+        </w:rPr>
+        <w:t>)</w:t>
+      </w:r>
+      <w:r>
+        <w:rPr>
+          <w:rFonts w:cs="Times New Roman"/>
+          <w:szCs w:val="24"/>
+          <w:lang w:eastAsia="pl-PL"/>
+        </w:rPr>
+        <w:t xml:space="preserve"> </w:t>
+      </w:r>
+      <w:r>
+        <w:rPr>
+          <w:rFonts w:cs="Times New Roman"/>
+          <w:szCs w:val="24"/>
+          <w:lang w:eastAsia="pl-PL"/>
+        </w:rPr>
+        <w:t>this comma</w:t>
+      </w:r>
+      <w:r>
+        <w:rPr>
+          <w:rFonts w:cs="Times New Roman"/>
           <w:szCs w:val="24"/>
           <w:lang w:eastAsia="pl-PL"/>
         </w:rPr>
@@ -4173,7 +4275,17 @@
           <w:szCs w:val="27"/>
           <w:lang w:eastAsia="pl-PL"/>
         </w:rPr>
-        <w:t>7.2 Stage Breakdown</w:t>
+        <w:t>7.2 Stage b</w:t>
+      </w:r>
+      <w:r>
+        <w:rPr>
+          <w:rFonts w:cs="Times New Roman"/>
+          <w:b/>
+          <w:bCs/>
+          <w:szCs w:val="27"/>
+          <w:lang w:eastAsia="pl-PL"/>
+        </w:rPr>
+        <w:t>reakdown</w:t>
       </w:r>
     </w:p>
     <w:p>
@@ -4881,6 +4993,7 @@
           <w:szCs w:val="24"/>
           <w:lang w:eastAsia="pl-PL"/>
         </w:rPr>
+        <w:lastRenderedPageBreak/>
         <w:t>o</w:t>
       </w:r>
       <w:r>
@@ -6404,11 +6517,21 @@
           <w:szCs w:val="20"/>
           <w:lang w:eastAsia="pl-PL"/>
         </w:rPr>
-        <w:t>2_OBIA_merge_classifications.py</w:t>
-      </w:r>
-      <w:r>
-        <w:rPr>
-          <w:rFonts w:cs="Times New Roman"/>
+        <w:t>2_</w:t>
+      </w:r>
+      <w:r>
+        <w:rPr>
+          <w:rFonts w:cs="Courier New"/>
+          <w:i/>
+          <w:szCs w:val="20"/>
+          <w:lang w:eastAsia="pl-PL"/>
+        </w:rPr>
+        <w:t>OBIA_merge_classifications.py</w:t>
+      </w:r>
+      <w:r>
+        <w:rPr>
+          <w:rFonts w:cs="Times New Roman"/>
+          <w:i/>
           <w:szCs w:val="24"/>
           <w:lang w:eastAsia="pl-PL"/>
         </w:rPr>
@@ -6465,6 +6588,7 @@
           <w:szCs w:val="24"/>
           <w:lang w:eastAsia="pl-PL"/>
         </w:rPr>
+        <w:lastRenderedPageBreak/>
         <w:t>When your AOI spans more than one Sentinel-1 belt (e.g. P1 + P1a), this script builds a single, highest-confidence mosaic and computes final metrics.</w:t>
       </w:r>
       <w:r>
@@ -6546,6 +6670,7 @@
       <w:r>
         <w:rPr>
           <w:rFonts w:cs="Courier New"/>
+          <w:i/>
           <w:szCs w:val="20"/>
           <w:lang w:eastAsia="pl-PL"/>
         </w:rPr>
@@ -7532,6 +7657,7 @@
           <w:szCs w:val="24"/>
           <w:lang w:eastAsia="pl-PL"/>
         </w:rPr>
+        <w:lastRenderedPageBreak/>
         <w:t xml:space="preserve">For each control point, uses the inverse geotransform to sample </w:t>
       </w:r>
       <w:r>
@@ -8638,7 +8764,16 @@
           <w:szCs w:val="20"/>
           <w:lang w:eastAsia="pl-PL"/>
         </w:rPr>
-        <w:t xml:space="preserve"> next to “Benchmark operator”), SNAP will suggest optimal tile sizes and thread counts based on your hardware. Re-run it whenever you change major settings.</w:t>
+        <w:t xml:space="preserve"> next to “Benchmark operator”), </w:t>
+      </w:r>
+      <w:r>
+        <w:rPr>
+          <w:rFonts w:cs="Courier New"/>
+          <w:szCs w:val="20"/>
+          <w:lang w:eastAsia="pl-PL"/>
+        </w:rPr>
+        <w:lastRenderedPageBreak/>
+        <w:t>SNAP will suggest optimal tile sizes and thread counts based on your hardware. Re-run it whenever you change major settings.</w:t>
       </w:r>
     </w:p>
     <w:p>
@@ -8793,6 +8928,7 @@
           <w:noProof/>
           <w:lang w:eastAsia="pl-PL"/>
         </w:rPr>
+        <w:lastRenderedPageBreak/>
         <w:drawing>
           <wp:inline distT="0" distB="0" distL="0" distR="0" wp14:anchorId="31F46576" wp14:editId="467F8692">
             <wp:extent cx="4747563" cy="4114800"/>
@@ -9351,7 +9487,17 @@
           <w:szCs w:val="20"/>
           <w:lang w:eastAsia="pl-PL"/>
         </w:rPr>
-        <w:t xml:space="preserve">time to </w:t>
+        <w:t xml:space="preserve">time </w:t>
+      </w:r>
+      <w:r>
+        <w:rPr>
+          <w:rFonts w:cs="Courier New"/>
+          <w:bCs/>
+          <w:szCs w:val="20"/>
+          <w:lang w:eastAsia="pl-PL"/>
+        </w:rPr>
+        <w:lastRenderedPageBreak/>
+        <w:t xml:space="preserve">to </w:t>
       </w:r>
       <w:r>
         <w:rPr>

</xml_diff>